<commit_message>
Updated the my notes file
</commit_message>
<xml_diff>
--- a/Unit3_Embedded_C/Lesson_3/Embedded_Systems_Notes.docx
+++ b/Unit3_Embedded_C/Lesson_3/Embedded_Systems_Notes.docx
@@ -10,10 +10,19 @@
       <w:r>
         <w:t>Embedded Systems - Key Concepts Notes</w:t>
       </w:r>
+      <w:r>
+        <w:t xml:space="preserve"> - </w:t>
+      </w:r>
+      <w:r>
+        <w:t>ENG. ADEL SHATA</w:t>
+      </w:r>
     </w:p>
     <w:p>
       <w:r>
         <w:t>ARM Cortex-M3 | STM32F103 | Bare-Metal Programming</w:t>
+      </w:r>
+      <w:r>
+        <w:t xml:space="preserve"> </w:t>
       </w:r>
     </w:p>
     <w:p/>
@@ -1687,13 +1696,7 @@
               <w:rPr>
                 <w:u w:val="single"/>
               </w:rPr>
-              <w:t xml:space="preserve">Const </w:t>
-            </w:r>
-            <w:r>
-              <w:rPr>
-                <w:u w:val="single"/>
-              </w:rPr>
-              <w:t>Local variables</w:t>
+              <w:t>Const Local variables</w:t>
             </w:r>
           </w:p>
         </w:tc>
@@ -1730,18 +1733,10 @@
               <w:t>Global variables</w:t>
             </w:r>
             <w:r>
-              <w:t xml:space="preserve">, Static </w:t>
-            </w:r>
-            <w:proofErr w:type="gramStart"/>
-            <w:r>
-              <w:t>Vars</w:t>
+              <w:t>, Static Vars</w:t>
             </w:r>
             <w:r>
-              <w:t>(</w:t>
-            </w:r>
-            <w:proofErr w:type="gramEnd"/>
-            <w:r>
-              <w:t>global or local)</w:t>
+              <w:t>(global or local)</w:t>
             </w:r>
           </w:p>
         </w:tc>
@@ -1776,28 +1771,17 @@
             </w:r>
             <w:proofErr w:type="spellStart"/>
             <w:r>
-              <w:t>U</w:t>
-            </w:r>
-            <w:r>
-              <w:t>nitialized</w:t>
+              <w:t>Unitialized</w:t>
             </w:r>
             <w:proofErr w:type="spellEnd"/>
             <w:r>
               <w:t>)</w:t>
             </w:r>
             <w:r>
-              <w:t xml:space="preserve">Global variables, Static </w:t>
-            </w:r>
-            <w:proofErr w:type="gramStart"/>
-            <w:r>
-              <w:t>Vars</w:t>
+              <w:t>Global variables, Static Vars</w:t>
             </w:r>
             <w:r>
-              <w:t>(</w:t>
-            </w:r>
-            <w:proofErr w:type="gramEnd"/>
-            <w:r>
-              <w:t>global or local)</w:t>
+              <w:t>(global or local)</w:t>
             </w:r>
           </w:p>
         </w:tc>
@@ -1809,7 +1793,6 @@
             <w:pPr>
               <w:cnfStyle w:val="000000100000" w:firstRow="0" w:lastRow="0" w:firstColumn="0" w:lastColumn="0" w:oddVBand="0" w:evenVBand="0" w:oddHBand="1" w:evenHBand="0" w:firstRowFirstColumn="0" w:firstRowLastColumn="0" w:lastRowFirstColumn="0" w:lastRowLastColumn="0"/>
             </w:pPr>
-            <w:proofErr w:type="gramStart"/>
             <w:r>
               <w:t>.</w:t>
             </w:r>
@@ -1818,24 +1801,8 @@
               <w:t>bss</w:t>
             </w:r>
             <w:proofErr w:type="spellEnd"/>
-            <w:proofErr w:type="gramEnd"/>
             <w:r>
-              <w:t xml:space="preserve"> in SRAM (zeroed</w:t>
-            </w:r>
-            <w:r>
-              <w:t xml:space="preserve"> in Ram</w:t>
-            </w:r>
-            <w:r>
-              <w:t xml:space="preserve"> </w:t>
-            </w:r>
-            <w:r>
-              <w:t>within</w:t>
-            </w:r>
-            <w:r>
-              <w:t xml:space="preserve"> startup</w:t>
-            </w:r>
-            <w:r>
-              <w:t xml:space="preserve">’s </w:t>
+              <w:t xml:space="preserve"> in SRAM (zeroed in Ram within startup’s </w:t>
             </w:r>
             <w:proofErr w:type="spellStart"/>
             <w:r>
@@ -1888,7 +1855,6 @@
             <w:pPr>
               <w:cnfStyle w:val="000000010000" w:firstRow="0" w:lastRow="0" w:firstColumn="0" w:lastColumn="0" w:oddVBand="0" w:evenVBand="0" w:oddHBand="0" w:evenHBand="1" w:firstRowFirstColumn="0" w:firstRowLastColumn="0" w:lastRowFirstColumn="0" w:lastRowLastColumn="0"/>
             </w:pPr>
-            <w:proofErr w:type="gramStart"/>
             <w:r>
               <w:t>.</w:t>
             </w:r>
@@ -1897,7 +1863,6 @@
               <w:t>rodata</w:t>
             </w:r>
             <w:proofErr w:type="spellEnd"/>
-            <w:proofErr w:type="gramEnd"/>
             <w:r>
               <w:t>(Flash)</w:t>
             </w:r>
@@ -1985,18 +1950,13 @@
               <w:cnfStyle w:val="000000010000" w:firstRow="0" w:lastRow="0" w:firstColumn="0" w:lastColumn="0" w:oddVBand="0" w:evenVBand="0" w:oddHBand="0" w:evenHBand="1" w:firstRowFirstColumn="0" w:firstRowLastColumn="0" w:lastRowFirstColumn="0" w:lastRowLastColumn="0"/>
             </w:pPr>
             <w:r>
-              <w:t>Mark functions with __attribute__((section(</w:t>
-            </w:r>
-            <w:proofErr w:type="gramStart"/>
-            <w:r>
-              <w:t>".</w:t>
+              <w:t>Mark functions with __attribute__((section(".</w:t>
             </w:r>
             <w:proofErr w:type="spellStart"/>
             <w:r>
               <w:t>ramfunc</w:t>
             </w:r>
             <w:proofErr w:type="spellEnd"/>
-            <w:proofErr w:type="gramEnd"/>
             <w:r>
               <w:t>"))), use &gt;ram AT&gt; flash, copy at startup.</w:t>
             </w:r>

</xml_diff>